<commit_message>
Set Team ID blank and update date to 06-07-2026 for brainstorming and project phase templates
</commit_message>
<xml_diff>
--- a/1. Brainstorming & Ideation/Brainstorming & Idea Prioritization.docx
+++ b/1. Brainstorming & Ideation/Brainstorming & Idea Prioritization.docx
@@ -12,9 +12,9 @@
     </w:p>
     <w:p>
       <w:r>
-        <w:t>Team ID: 12344 | Project Name: Opticrop</w:t>
+        <w:t>Team ID:  | Project Name: Opticrop</w:t>
         <w:br/>
-        <w:t>Date: 06 july-2026</w:t>
+        <w:t>Date: 06-07-2026</w:t>
         <w:br/>
         <w:br/>
       </w:r>

</xml_diff>